<commit_message>
Spot the Slip tabs for FN1 and EL1-EL4; EL5 fixes (named answers, intro, correct-work item, balanced choices); EL3 minus-sign labels (audit pending)
Co-Authored-By: Claude Opus 5.5 <noreply@anthropic.com>
Claude-Session: https://claude.ai/code/session_013Y8PfETWcMLvmUEpCdE8Wq
</commit_message>
<xml_diff>
--- a/support-materials/EL1/EL1_worked_examples.docx
+++ b/support-materials/EL1/EL1_worked_examples.docx
@@ -4892,6 +4892,1572 @@
         <w:t xml:space="preserve"> shows exponential decay.</w:t>
       </w:r>
     </w:p>
+    <w:p>
+      <w:pPr>
+        <w:pStyle w:val="Heading2"/>
+        <w:pageBreakBefore/>
+      </w:pPr>
+      <w:r>
+        <w:t xml:space="preserve">Example 15: Slip 1</w:t>
+      </w:r>
+    </w:p>
+    <w:p>
+      <w:pPr>
+        <w:keepNext/>
+        <w:spacing w:after="120" w:before="80" w:line="300"/>
+      </w:pPr>
+      <w:r>
+        <w:rPr>
+          <w:b/>
+          <w:bCs/>
+        </w:rPr>
+        <w:t xml:space="preserve">Table 5. </w:t>
+      </w:r>
+      <w:r>
+        <w:t xml:space="preserve">Table of x-values and y-values, listed in two rows</w:t>
+      </w:r>
+    </w:p>
+    <w:tbl>
+      <w:tblPr>
+        <w:tblW w:type="dxa" w:w="9000"/>
+        <w:tblBorders>
+          <w:top w:val="single" w:color="auto" w:sz="4"/>
+          <w:left w:val="single" w:color="auto" w:sz="4"/>
+          <w:bottom w:val="single" w:color="auto" w:sz="4"/>
+          <w:right w:val="single" w:color="auto" w:sz="4"/>
+          <w:insideH w:val="single" w:color="auto" w:sz="4"/>
+          <w:insideV w:val="single" w:color="auto" w:sz="4"/>
+        </w:tblBorders>
+      </w:tblPr>
+      <w:tblGrid>
+        <w:gridCol w:w="1100"/>
+        <w:gridCol w:w="1975"/>
+        <w:gridCol w:w="1975"/>
+        <w:gridCol w:w="1975"/>
+        <w:gridCol w:w="1975"/>
+      </w:tblGrid>
+      <w:tr>
+        <w:tc>
+          <w:tcPr>
+            <w:tcW w:type="dxa" w:w="1100"/>
+            <w:tcBorders>
+              <w:top w:val="single" w:color="555555" w:sz="6"/>
+              <w:left w:val="single" w:color="555555" w:sz="6"/>
+              <w:bottom w:val="single" w:color="555555" w:sz="6"/>
+              <w:right w:val="single" w:color="555555" w:sz="6"/>
+            </w:tcBorders>
+            <w:shd w:fill="E6F4F4" w:val="clear"/>
+            <w:tcMar>
+              <w:top w:type="dxa" w:w="80"/>
+              <w:left w:type="dxa" w:w="120"/>
+              <w:bottom w:type="dxa" w:w="80"/>
+              <w:right w:type="dxa" w:w="120"/>
+            </w:tcMar>
+          </w:tcPr>
+          <w:p>
+            <w:pPr>
+              <w:jc w:val="center"/>
+            </w:pPr>
+            <w:r>
+              <w:rPr>
+                <w:b/>
+                <w:bCs/>
+                <w:sz w:val="28"/>
+                <w:szCs w:val="28"/>
+              </w:rPr>
+              <w:t xml:space="preserve">x</w:t>
+            </w:r>
+          </w:p>
+        </w:tc>
+        <w:tc>
+          <w:tcPr>
+            <w:tcW w:type="dxa" w:w="1975"/>
+            <w:tcBorders>
+              <w:top w:val="single" w:color="555555" w:sz="6"/>
+              <w:left w:val="single" w:color="555555" w:sz="6"/>
+              <w:bottom w:val="single" w:color="555555" w:sz="6"/>
+              <w:right w:val="single" w:color="555555" w:sz="6"/>
+            </w:tcBorders>
+            <w:tcMar>
+              <w:top w:type="dxa" w:w="80"/>
+              <w:left w:type="dxa" w:w="120"/>
+              <w:bottom w:type="dxa" w:w="80"/>
+              <w:right w:type="dxa" w:w="120"/>
+            </w:tcMar>
+          </w:tcPr>
+          <w:p>
+            <w:pPr>
+              <w:jc w:val="center"/>
+            </w:pPr>
+            <w:r>
+              <w:rPr>
+                <w:b w:val="false"/>
+                <w:bCs w:val="false"/>
+                <w:sz w:val="28"/>
+                <w:szCs w:val="28"/>
+              </w:rPr>
+              <w:t xml:space="preserve">1</w:t>
+            </w:r>
+          </w:p>
+        </w:tc>
+        <w:tc>
+          <w:tcPr>
+            <w:tcW w:type="dxa" w:w="1975"/>
+            <w:tcBorders>
+              <w:top w:val="single" w:color="555555" w:sz="6"/>
+              <w:left w:val="single" w:color="555555" w:sz="6"/>
+              <w:bottom w:val="single" w:color="555555" w:sz="6"/>
+              <w:right w:val="single" w:color="555555" w:sz="6"/>
+            </w:tcBorders>
+            <w:tcMar>
+              <w:top w:type="dxa" w:w="80"/>
+              <w:left w:type="dxa" w:w="120"/>
+              <w:bottom w:type="dxa" w:w="80"/>
+              <w:right w:type="dxa" w:w="120"/>
+            </w:tcMar>
+          </w:tcPr>
+          <w:p>
+            <w:pPr>
+              <w:jc w:val="center"/>
+            </w:pPr>
+            <w:r>
+              <w:rPr>
+                <w:b w:val="false"/>
+                <w:bCs w:val="false"/>
+                <w:sz w:val="28"/>
+                <w:szCs w:val="28"/>
+              </w:rPr>
+              <w:t xml:space="preserve">2</w:t>
+            </w:r>
+          </w:p>
+        </w:tc>
+        <w:tc>
+          <w:tcPr>
+            <w:tcW w:type="dxa" w:w="1975"/>
+            <w:tcBorders>
+              <w:top w:val="single" w:color="555555" w:sz="6"/>
+              <w:left w:val="single" w:color="555555" w:sz="6"/>
+              <w:bottom w:val="single" w:color="555555" w:sz="6"/>
+              <w:right w:val="single" w:color="555555" w:sz="6"/>
+            </w:tcBorders>
+            <w:tcMar>
+              <w:top w:type="dxa" w:w="80"/>
+              <w:left w:type="dxa" w:w="120"/>
+              <w:bottom w:type="dxa" w:w="80"/>
+              <w:right w:type="dxa" w:w="120"/>
+            </w:tcMar>
+          </w:tcPr>
+          <w:p>
+            <w:pPr>
+              <w:jc w:val="center"/>
+            </w:pPr>
+            <w:r>
+              <w:rPr>
+                <w:b w:val="false"/>
+                <w:bCs w:val="false"/>
+                <w:sz w:val="28"/>
+                <w:szCs w:val="28"/>
+              </w:rPr>
+              <w:t xml:space="preserve">3</w:t>
+            </w:r>
+          </w:p>
+        </w:tc>
+        <w:tc>
+          <w:tcPr>
+            <w:tcW w:type="dxa" w:w="1975"/>
+            <w:tcBorders>
+              <w:top w:val="single" w:color="555555" w:sz="6"/>
+              <w:left w:val="single" w:color="555555" w:sz="6"/>
+              <w:bottom w:val="single" w:color="555555" w:sz="6"/>
+              <w:right w:val="single" w:color="555555" w:sz="6"/>
+            </w:tcBorders>
+            <w:tcMar>
+              <w:top w:type="dxa" w:w="80"/>
+              <w:left w:type="dxa" w:w="120"/>
+              <w:bottom w:type="dxa" w:w="80"/>
+              <w:right w:type="dxa" w:w="120"/>
+            </w:tcMar>
+          </w:tcPr>
+          <w:p>
+            <w:pPr>
+              <w:jc w:val="center"/>
+            </w:pPr>
+            <w:r>
+              <w:rPr>
+                <w:b w:val="false"/>
+                <w:bCs w:val="false"/>
+                <w:sz w:val="28"/>
+                <w:szCs w:val="28"/>
+              </w:rPr>
+              <w:t xml:space="preserve">4</w:t>
+            </w:r>
+          </w:p>
+        </w:tc>
+      </w:tr>
+      <w:tr>
+        <w:tc>
+          <w:tcPr>
+            <w:tcW w:type="dxa" w:w="1100"/>
+            <w:tcBorders>
+              <w:top w:val="single" w:color="555555" w:sz="6"/>
+              <w:left w:val="single" w:color="555555" w:sz="6"/>
+              <w:bottom w:val="single" w:color="555555" w:sz="6"/>
+              <w:right w:val="single" w:color="555555" w:sz="6"/>
+            </w:tcBorders>
+            <w:shd w:fill="E6F4F4" w:val="clear"/>
+            <w:tcMar>
+              <w:top w:type="dxa" w:w="80"/>
+              <w:left w:type="dxa" w:w="120"/>
+              <w:bottom w:type="dxa" w:w="80"/>
+              <w:right w:type="dxa" w:w="120"/>
+            </w:tcMar>
+          </w:tcPr>
+          <w:p>
+            <w:pPr>
+              <w:jc w:val="center"/>
+            </w:pPr>
+            <w:r>
+              <w:rPr>
+                <w:b/>
+                <w:bCs/>
+                <w:sz w:val="28"/>
+                <w:szCs w:val="28"/>
+              </w:rPr>
+              <w:t xml:space="preserve">y</w:t>
+            </w:r>
+          </w:p>
+        </w:tc>
+        <w:tc>
+          <w:tcPr>
+            <w:tcW w:type="dxa" w:w="1975"/>
+            <w:tcBorders>
+              <w:top w:val="single" w:color="555555" w:sz="6"/>
+              <w:left w:val="single" w:color="555555" w:sz="6"/>
+              <w:bottom w:val="single" w:color="555555" w:sz="6"/>
+              <w:right w:val="single" w:color="555555" w:sz="6"/>
+            </w:tcBorders>
+            <w:tcMar>
+              <w:top w:type="dxa" w:w="80"/>
+              <w:left w:type="dxa" w:w="120"/>
+              <w:bottom w:type="dxa" w:w="80"/>
+              <w:right w:type="dxa" w:w="120"/>
+            </w:tcMar>
+          </w:tcPr>
+          <w:p>
+            <w:pPr>
+              <w:jc w:val="center"/>
+            </w:pPr>
+            <w:r>
+              <w:rPr>
+                <w:b w:val="false"/>
+                <w:bCs w:val="false"/>
+                <w:sz w:val="28"/>
+                <w:szCs w:val="28"/>
+              </w:rPr>
+              <w:t xml:space="preserve">2</w:t>
+            </w:r>
+          </w:p>
+        </w:tc>
+        <w:tc>
+          <w:tcPr>
+            <w:tcW w:type="dxa" w:w="1975"/>
+            <w:tcBorders>
+              <w:top w:val="single" w:color="555555" w:sz="6"/>
+              <w:left w:val="single" w:color="555555" w:sz="6"/>
+              <w:bottom w:val="single" w:color="555555" w:sz="6"/>
+              <w:right w:val="single" w:color="555555" w:sz="6"/>
+            </w:tcBorders>
+            <w:tcMar>
+              <w:top w:type="dxa" w:w="80"/>
+              <w:left w:type="dxa" w:w="120"/>
+              <w:bottom w:type="dxa" w:w="80"/>
+              <w:right w:type="dxa" w:w="120"/>
+            </w:tcMar>
+          </w:tcPr>
+          <w:p>
+            <w:pPr>
+              <w:jc w:val="center"/>
+            </w:pPr>
+            <w:r>
+              <w:rPr>
+                <w:b w:val="false"/>
+                <w:bCs w:val="false"/>
+                <w:sz w:val="28"/>
+                <w:szCs w:val="28"/>
+              </w:rPr>
+              <w:t xml:space="preserve">6</w:t>
+            </w:r>
+          </w:p>
+        </w:tc>
+        <w:tc>
+          <w:tcPr>
+            <w:tcW w:type="dxa" w:w="1975"/>
+            <w:tcBorders>
+              <w:top w:val="single" w:color="555555" w:sz="6"/>
+              <w:left w:val="single" w:color="555555" w:sz="6"/>
+              <w:bottom w:val="single" w:color="555555" w:sz="6"/>
+              <w:right w:val="single" w:color="555555" w:sz="6"/>
+            </w:tcBorders>
+            <w:tcMar>
+              <w:top w:type="dxa" w:w="80"/>
+              <w:left w:type="dxa" w:w="120"/>
+              <w:bottom w:type="dxa" w:w="80"/>
+              <w:right w:type="dxa" w:w="120"/>
+            </w:tcMar>
+          </w:tcPr>
+          <w:p>
+            <w:pPr>
+              <w:jc w:val="center"/>
+            </w:pPr>
+            <w:r>
+              <w:rPr>
+                <w:b w:val="false"/>
+                <w:bCs w:val="false"/>
+                <w:sz w:val="28"/>
+                <w:szCs w:val="28"/>
+              </w:rPr>
+              <w:t xml:space="preserve">18</w:t>
+            </w:r>
+          </w:p>
+        </w:tc>
+        <w:tc>
+          <w:tcPr>
+            <w:tcW w:type="dxa" w:w="1975"/>
+            <w:tcBorders>
+              <w:top w:val="single" w:color="555555" w:sz="6"/>
+              <w:left w:val="single" w:color="555555" w:sz="6"/>
+              <w:bottom w:val="single" w:color="555555" w:sz="6"/>
+              <w:right w:val="single" w:color="555555" w:sz="6"/>
+            </w:tcBorders>
+            <w:tcMar>
+              <w:top w:type="dxa" w:w="80"/>
+              <w:left w:type="dxa" w:w="120"/>
+              <w:bottom w:type="dxa" w:w="80"/>
+              <w:right w:type="dxa" w:w="120"/>
+            </w:tcMar>
+          </w:tcPr>
+          <w:p>
+            <w:pPr>
+              <w:jc w:val="center"/>
+            </w:pPr>
+            <w:r>
+              <w:rPr>
+                <w:b w:val="false"/>
+                <w:bCs w:val="false"/>
+                <w:sz w:val="28"/>
+                <w:szCs w:val="28"/>
+              </w:rPr>
+              <w:t xml:space="preserve">54</w:t>
+            </w:r>
+          </w:p>
+        </w:tc>
+      </w:tr>
+    </w:tbl>
+    <w:p>
+      <w:pPr>
+        <w:pStyle w:val="Heading3"/>
+        <w:keepNext/>
+      </w:pPr>
+      <w:r>
+        <w:t xml:space="preserve">Question</w:t>
+      </w:r>
+    </w:p>
+    <w:p>
+      <w:pPr>
+        <w:spacing w:after="120" w:before="80" w:line="300"/>
+      </w:pPr>
+      <w:r>
+        <w:t xml:space="preserve">A student found the differences 4, 12, and 36. They are not equal, so the student says the table is not exponential. What is the mistake, if any?</w:t>
+      </w:r>
+    </w:p>
+    <w:p>
+      <w:pPr>
+        <w:spacing w:after="40" w:before="20"/>
+        <w:ind w:left="360"/>
+      </w:pPr>
+      <w:r>
+        <w:rPr>
+          <w:b/>
+          <w:bCs/>
+        </w:rPr>
+        <w:t xml:space="preserve">A.  </w:t>
+      </w:r>
+      <w:r>
+        <w:t xml:space="preserve">There is no mistake.</w:t>
+      </w:r>
+    </w:p>
+    <w:p>
+      <w:pPr>
+        <w:spacing w:after="40" w:before="20"/>
+        <w:ind w:left="360"/>
+      </w:pPr>
+      <w:r>
+        <w:rPr>
+          <w:b/>
+          <w:bCs/>
+        </w:rPr>
+        <w:t xml:space="preserve">B.  </w:t>
+      </w:r>
+      <w:r>
+        <w:t xml:space="preserve">The differences are equal once you divide each one by 2.</w:t>
+      </w:r>
+    </w:p>
+    <w:p>
+      <w:pPr>
+        <w:spacing w:after="40" w:before="20"/>
+        <w:ind w:left="360"/>
+      </w:pPr>
+      <w:r>
+        <w:rPr>
+          <w:b/>
+          <w:bCs/>
+        </w:rPr>
+        <w:t xml:space="preserve">C.  </w:t>
+      </w:r>
+      <w:r>
+        <w:t xml:space="preserve">Equal differences mean linear; for exponential, check ratios.</w:t>
+      </w:r>
+    </w:p>
+    <w:p>
+      <w:pPr>
+        <w:spacing w:after="40" w:before="20"/>
+        <w:ind w:left="360"/>
+      </w:pPr>
+      <w:r>
+        <w:rPr>
+          <w:b/>
+          <w:bCs/>
+        </w:rPr>
+        <w:t xml:space="preserve">D.  </w:t>
+      </w:r>
+      <w:r>
+        <w:t xml:space="preserve">A table that rises this fast has to be linear, not exponential.</w:t>
+      </w:r>
+    </w:p>
+    <w:p>
+      <w:pPr>
+        <w:pStyle w:val="Heading3"/>
+        <w:keepNext/>
+      </w:pPr>
+      <w:r>
+        <w:t xml:space="preserve">Answer and reasoning</w:t>
+      </w:r>
+    </w:p>
+    <w:p>
+      <w:pPr>
+        <w:spacing w:after="120" w:before="80" w:line="300"/>
+      </w:pPr>
+      <w:r>
+        <w:t xml:space="preserve">Exponential means multiplying by the same number each step, so divide each y-value by the one before: </w:t>
+      </w:r>
+      <w:r>
+        <w:rPr>
+          <w:i/>
+          <w:iCs/>
+        </w:rPr>
+        <w:t xml:space="preserve">6div 2=3</w:t>
+      </w:r>
+      <w:r>
+        <w:t xml:space="preserve">, </w:t>
+      </w:r>
+      <w:r>
+        <w:rPr>
+          <w:i/>
+          <w:iCs/>
+        </w:rPr>
+        <w:t xml:space="preserve">18div 6=3</w:t>
+      </w:r>
+      <w:r>
+        <w:t xml:space="preserve">, </w:t>
+      </w:r>
+      <w:r>
+        <w:rPr>
+          <w:i/>
+          <w:iCs/>
+        </w:rPr>
+        <w:t xml:space="preserve">54div 18=3</w:t>
+      </w:r>
+      <w:r>
+        <w:t xml:space="preserve">. The ratios are all 3. Unequal differences only rule out linear. </w:t>
+      </w:r>
+      <w:r>
+        <w:rPr>
+          <w:b/>
+          <w:bCs/>
+        </w:rPr>
+        <w:t xml:space="preserve">The table is exponential, with </w:t>
+      </w:r>
+      <w:r>
+        <w:rPr>
+          <w:b/>
+          <w:bCs/>
+          <w:i/>
+          <w:iCs/>
+        </w:rPr>
+        <w:t xml:space="preserve">b=3</w:t>
+      </w:r>
+      <w:r>
+        <w:rPr>
+          <w:b/>
+          <w:bCs/>
+        </w:rPr>
+        <w:t xml:space="preserve">.</w:t>
+      </w:r>
+    </w:p>
+    <w:p>
+      <w:pPr>
+        <w:pStyle w:val="Heading2"/>
+        <w:pageBreakBefore/>
+      </w:pPr>
+      <w:r>
+        <w:t xml:space="preserve">Example 16: Slip 2</w:t>
+      </w:r>
+    </w:p>
+    <w:p>
+      <w:pPr>
+        <w:spacing w:after="40" w:before="200"/>
+        <w:jc w:val="center"/>
+      </w:pPr>
+      <w:r>
+        <w:rPr>
+          <w:i/>
+          <w:iCs/>
+          <w:sz w:val="40"/>
+          <w:szCs w:val="40"/>
+        </w:rPr>
+        <w:t xml:space="preserve">4· b</w:t>
+      </w:r>
+      <w:r>
+        <w:rPr>
+          <w:i/>
+          <w:iCs/>
+          <w:sz w:val="40"/>
+          <w:szCs w:val="40"/>
+          <w:vertAlign w:val="superscript"/>
+        </w:rPr>
+        <w:t xml:space="preserve">2</w:t>
+      </w:r>
+      <w:r>
+        <w:rPr>
+          <w:i/>
+          <w:iCs/>
+          <w:sz w:val="40"/>
+          <w:szCs w:val="40"/>
+        </w:rPr>
+        <w:t xml:space="preserve">=36</w:t>
+      </w:r>
+    </w:p>
+    <w:p>
+      <w:pPr>
+        <w:spacing w:after="40" w:before="40"/>
+        <w:jc w:val="center"/>
+      </w:pPr>
+      <w:r>
+        <w:rPr>
+          <w:i/>
+          <w:iCs/>
+          <w:sz w:val="40"/>
+          <w:szCs w:val="40"/>
+        </w:rPr>
+        <w:t xml:space="preserve">b</w:t>
+      </w:r>
+      <w:r>
+        <w:rPr>
+          <w:i/>
+          <w:iCs/>
+          <w:sz w:val="40"/>
+          <w:szCs w:val="40"/>
+          <w:vertAlign w:val="superscript"/>
+        </w:rPr>
+        <w:t xml:space="preserve">2</w:t>
+      </w:r>
+      <w:r>
+        <w:rPr>
+          <w:i/>
+          <w:iCs/>
+          <w:sz w:val="40"/>
+          <w:szCs w:val="40"/>
+        </w:rPr>
+        <w:t xml:space="preserve">=9</w:t>
+      </w:r>
+    </w:p>
+    <w:p>
+      <w:pPr>
+        <w:spacing w:after="200" w:before="40"/>
+        <w:jc w:val="center"/>
+      </w:pPr>
+      <w:r>
+        <w:rPr>
+          <w:i/>
+          <w:iCs/>
+          <w:sz w:val="40"/>
+          <w:szCs w:val="40"/>
+        </w:rPr>
+        <w:t xml:space="preserve">b=9</w:t>
+      </w:r>
+    </w:p>
+    <w:p>
+      <w:pPr>
+        <w:pStyle w:val="Heading3"/>
+        <w:keepNext/>
+      </w:pPr>
+      <w:r>
+        <w:t xml:space="preserve">Question</w:t>
+      </w:r>
+    </w:p>
+    <w:p>
+      <w:pPr>
+        <w:spacing w:after="120" w:before="80" w:line="300"/>
+      </w:pPr>
+      <w:r>
+        <w:t xml:space="preserve">A student used the points </w:t>
+      </w:r>
+      <w:r>
+        <w:rPr>
+          <w:i/>
+          <w:iCs/>
+        </w:rPr>
+        <w:t xml:space="preserve">(0,4)</w:t>
+      </w:r>
+      <w:r>
+        <w:t xml:space="preserve"> and </w:t>
+      </w:r>
+      <w:r>
+        <w:rPr>
+          <w:i/>
+          <w:iCs/>
+        </w:rPr>
+        <w:t xml:space="preserve">(2,36)</w:t>
+      </w:r>
+      <w:r>
+        <w:t xml:space="preserve"> and wrote this. What is the mistake, if any?</w:t>
+      </w:r>
+    </w:p>
+    <w:p>
+      <w:pPr>
+        <w:spacing w:after="40" w:before="20"/>
+        <w:ind w:left="360"/>
+      </w:pPr>
+      <w:r>
+        <w:rPr>
+          <w:b/>
+          <w:bCs/>
+        </w:rPr>
+        <w:t xml:space="preserve">A.  </w:t>
+      </w:r>
+      <w:r>
+        <w:t xml:space="preserve">The last step needs a square root, so </w:t>
+      </w:r>
+      <w:r>
+        <w:rPr>
+          <w:i/>
+          <w:iCs/>
+        </w:rPr>
+        <w:t xml:space="preserve">b=3</w:t>
+      </w:r>
+      <w:r>
+        <w:t xml:space="preserve">.</w:t>
+      </w:r>
+    </w:p>
+    <w:p>
+      <w:pPr>
+        <w:spacing w:after="40" w:before="20"/>
+        <w:ind w:left="360"/>
+      </w:pPr>
+      <w:r>
+        <w:rPr>
+          <w:b/>
+          <w:bCs/>
+        </w:rPr>
+        <w:t xml:space="preserve">B.  </w:t>
+      </w:r>
+      <w:r>
+        <w:t xml:space="preserve">The 4 should be added, not multiplied, so </w:t>
+      </w:r>
+      <w:r>
+        <w:rPr>
+          <w:i/>
+          <w:iCs/>
+        </w:rPr>
+        <w:t xml:space="preserve">b=32</w:t>
+      </w:r>
+      <w:r>
+        <w:t xml:space="preserve">.</w:t>
+      </w:r>
+    </w:p>
+    <w:p>
+      <w:pPr>
+        <w:spacing w:after="40" w:before="20"/>
+        <w:ind w:left="360"/>
+      </w:pPr>
+      <w:r>
+        <w:rPr>
+          <w:b/>
+          <w:bCs/>
+        </w:rPr>
+        <w:t xml:space="preserve">C.  </w:t>
+      </w:r>
+      <w:r>
+        <w:t xml:space="preserve">There is no mistake.</w:t>
+      </w:r>
+    </w:p>
+    <w:p>
+      <w:pPr>
+        <w:spacing w:after="40" w:before="20"/>
+        <w:ind w:left="360"/>
+      </w:pPr>
+      <w:r>
+        <w:rPr>
+          <w:b/>
+          <w:bCs/>
+        </w:rPr>
+        <w:t xml:space="preserve">D.  </w:t>
+      </w:r>
+      <w:r>
+        <w:t xml:space="preserve">The base can be negative here, so </w:t>
+      </w:r>
+      <w:r>
+        <w:rPr>
+          <w:i/>
+          <w:iCs/>
+        </w:rPr>
+        <w:t xml:space="preserve">b=−3</w:t>
+      </w:r>
+      <w:r>
+        <w:t xml:space="preserve">.</w:t>
+      </w:r>
+    </w:p>
+    <w:p>
+      <w:pPr>
+        <w:pStyle w:val="Heading3"/>
+        <w:keepNext/>
+      </w:pPr>
+      <w:r>
+        <w:t xml:space="preserve">Answer and reasoning</w:t>
+      </w:r>
+    </w:p>
+    <w:p>
+      <w:pPr>
+        <w:spacing w:after="120" w:before="80" w:line="300"/>
+      </w:pPr>
+      <w:r>
+        <w:rPr>
+          <w:i/>
+          <w:iCs/>
+        </w:rPr>
+        <w:t xml:space="preserve">b</w:t>
+      </w:r>
+      <w:r>
+        <w:rPr>
+          <w:i/>
+          <w:iCs/>
+          <w:vertAlign w:val="superscript"/>
+        </w:rPr>
+        <w:t xml:space="preserve">2</w:t>
+      </w:r>
+      <w:r>
+        <w:rPr>
+          <w:i/>
+          <w:iCs/>
+        </w:rPr>
+        <w:t xml:space="preserve">=9</w:t>
+      </w:r>
+      <w:r>
+        <w:t xml:space="preserve"> means </w:t>
+      </w:r>
+      <w:r>
+        <w:rPr>
+          <w:i/>
+          <w:iCs/>
+        </w:rPr>
+        <w:t xml:space="preserve">b</w:t>
+      </w:r>
+      <w:r>
+        <w:t xml:space="preserve"> times itself is 9, so take the square root: </w:t>
+      </w:r>
+      <w:r>
+        <w:rPr>
+          <w:i/>
+          <w:iCs/>
+        </w:rPr>
+        <w:t xml:space="preserve">b=3</w:t>
+      </w:r>
+      <w:r>
+        <w:t xml:space="preserve">. The base of an exponential function must be positive, so </w:t>
+      </w:r>
+      <w:r>
+        <w:rPr>
+          <w:i/>
+          <w:iCs/>
+        </w:rPr>
+        <w:t xml:space="preserve">−3</w:t>
+      </w:r>
+      <w:r>
+        <w:t xml:space="preserve"> is out. Check: </w:t>
+      </w:r>
+      <w:r>
+        <w:rPr>
+          <w:i/>
+          <w:iCs/>
+        </w:rPr>
+        <w:t xml:space="preserve">4· 3</w:t>
+      </w:r>
+      <w:r>
+        <w:rPr>
+          <w:i/>
+          <w:iCs/>
+          <w:vertAlign w:val="superscript"/>
+        </w:rPr>
+        <w:t xml:space="preserve">2</w:t>
+      </w:r>
+      <w:r>
+        <w:rPr>
+          <w:i/>
+          <w:iCs/>
+        </w:rPr>
+        <w:t xml:space="preserve">=36</w:t>
+      </w:r>
+      <w:r>
+        <w:t xml:space="preserve">. </w:t>
+      </w:r>
+      <w:r>
+        <w:rPr>
+          <w:b/>
+          <w:bCs/>
+        </w:rPr>
+        <w:t xml:space="preserve">The function is </w:t>
+      </w:r>
+      <w:r>
+        <w:rPr>
+          <w:b/>
+          <w:bCs/>
+          <w:i/>
+          <w:iCs/>
+        </w:rPr>
+        <w:t xml:space="preserve">y=4· 3</w:t>
+      </w:r>
+      <w:r>
+        <w:rPr>
+          <w:b/>
+          <w:bCs/>
+          <w:i/>
+          <w:iCs/>
+          <w:vertAlign w:val="superscript"/>
+        </w:rPr>
+        <w:t xml:space="preserve">x</w:t>
+      </w:r>
+      <w:r>
+        <w:rPr>
+          <w:b/>
+          <w:bCs/>
+        </w:rPr>
+        <w:t xml:space="preserve">.</w:t>
+      </w:r>
+    </w:p>
+    <w:p>
+      <w:pPr>
+        <w:pStyle w:val="Heading2"/>
+        <w:pageBreakBefore/>
+      </w:pPr>
+      <w:r>
+        <w:t xml:space="preserve">Example 17: Slip 3</w:t>
+      </w:r>
+    </w:p>
+    <w:p>
+      <w:pPr>
+        <w:spacing w:after="40" w:before="200"/>
+        <w:jc w:val="center"/>
+      </w:pPr>
+      <w:r>
+        <w:rPr>
+          <w:i/>
+          <w:iCs/>
+          <w:sz w:val="40"/>
+          <w:szCs w:val="40"/>
+        </w:rPr>
+        <w:t xml:space="preserve">f(x)=2· 3</w:t>
+      </w:r>
+      <w:r>
+        <w:rPr>
+          <w:i/>
+          <w:iCs/>
+          <w:sz w:val="40"/>
+          <w:szCs w:val="40"/>
+          <w:vertAlign w:val="superscript"/>
+        </w:rPr>
+        <w:t xml:space="preserve">x</w:t>
+      </w:r>
+    </w:p>
+    <w:p>
+      <w:pPr>
+        <w:spacing w:after="200" w:before="40"/>
+        <w:jc w:val="center"/>
+      </w:pPr>
+      <w:r>
+        <w:rPr>
+          <w:i/>
+          <w:iCs/>
+          <w:sz w:val="40"/>
+          <w:szCs w:val="40"/>
+        </w:rPr>
+        <w:t xml:space="preserve">f(2)=6</w:t>
+      </w:r>
+      <w:r>
+        <w:rPr>
+          <w:i/>
+          <w:iCs/>
+          <w:sz w:val="40"/>
+          <w:szCs w:val="40"/>
+          <w:vertAlign w:val="superscript"/>
+        </w:rPr>
+        <w:t xml:space="preserve">2</w:t>
+      </w:r>
+      <w:r>
+        <w:rPr>
+          <w:i/>
+          <w:iCs/>
+          <w:sz w:val="40"/>
+          <w:szCs w:val="40"/>
+        </w:rPr>
+        <w:t xml:space="preserve">=36</w:t>
+      </w:r>
+    </w:p>
+    <w:p>
+      <w:pPr>
+        <w:pStyle w:val="Heading3"/>
+        <w:keepNext/>
+      </w:pPr>
+      <w:r>
+        <w:t xml:space="preserve">Question</w:t>
+      </w:r>
+    </w:p>
+    <w:p>
+      <w:pPr>
+        <w:spacing w:after="120" w:before="80" w:line="300"/>
+      </w:pPr>
+      <w:r>
+        <w:t xml:space="preserve">A student wrote this. What is the mistake, if any?</w:t>
+      </w:r>
+    </w:p>
+    <w:p>
+      <w:pPr>
+        <w:spacing w:after="40" w:before="20"/>
+        <w:ind w:left="360"/>
+      </w:pPr>
+      <w:r>
+        <w:rPr>
+          <w:b/>
+          <w:bCs/>
+        </w:rPr>
+        <w:t xml:space="preserve">A.  </w:t>
+      </w:r>
+      <w:r>
+        <w:t xml:space="preserve">There is no mistake.</w:t>
+      </w:r>
+    </w:p>
+    <w:p>
+      <w:pPr>
+        <w:spacing w:after="40" w:before="20"/>
+        <w:ind w:left="360"/>
+      </w:pPr>
+      <w:r>
+        <w:rPr>
+          <w:b/>
+          <w:bCs/>
+        </w:rPr>
+        <w:t xml:space="preserve">B.  </w:t>
+      </w:r>
+      <w:r>
+        <w:t xml:space="preserve">Do the power first: 3 squared is 9, and 2 times 9 is 18.</w:t>
+      </w:r>
+    </w:p>
+    <w:p>
+      <w:pPr>
+        <w:spacing w:after="40" w:before="20"/>
+        <w:ind w:left="360"/>
+      </w:pPr>
+      <w:r>
+        <w:rPr>
+          <w:b/>
+          <w:bCs/>
+        </w:rPr>
+        <w:t xml:space="preserve">C.  </w:t>
+      </w:r>
+      <w:r>
+        <w:t xml:space="preserve">The 2 should be the exponent, so the answer is 9 squared.</w:t>
+      </w:r>
+    </w:p>
+    <w:p>
+      <w:pPr>
+        <w:spacing w:after="40" w:before="20"/>
+        <w:ind w:left="360"/>
+      </w:pPr>
+      <w:r>
+        <w:rPr>
+          <w:b/>
+          <w:bCs/>
+        </w:rPr>
+        <w:t xml:space="preserve">D.  </w:t>
+      </w:r>
+      <w:r>
+        <w:t xml:space="preserve">The answer should be 2 plus 9, which is 11.</w:t>
+      </w:r>
+    </w:p>
+    <w:p>
+      <w:pPr>
+        <w:pStyle w:val="Heading3"/>
+        <w:keepNext/>
+      </w:pPr>
+      <w:r>
+        <w:t xml:space="preserve">Answer and reasoning</w:t>
+      </w:r>
+    </w:p>
+    <w:p>
+      <w:pPr>
+        <w:spacing w:after="120" w:before="80" w:line="300"/>
+      </w:pPr>
+      <w:r>
+        <w:t xml:space="preserve">The exponent belongs to the 3 only. Find the power first, </w:t>
+      </w:r>
+      <w:r>
+        <w:rPr>
+          <w:i/>
+          <w:iCs/>
+        </w:rPr>
+        <w:t xml:space="preserve">3</w:t>
+      </w:r>
+      <w:r>
+        <w:rPr>
+          <w:i/>
+          <w:iCs/>
+          <w:vertAlign w:val="superscript"/>
+        </w:rPr>
+        <w:t xml:space="preserve">2</w:t>
+      </w:r>
+      <w:r>
+        <w:rPr>
+          <w:i/>
+          <w:iCs/>
+        </w:rPr>
+        <w:t xml:space="preserve">=9</w:t>
+      </w:r>
+      <w:r>
+        <w:t xml:space="preserve">, then multiply: </w:t>
+      </w:r>
+      <w:r>
+        <w:rPr>
+          <w:i/>
+          <w:iCs/>
+        </w:rPr>
+        <w:t xml:space="preserve">2· 9=18</w:t>
+      </w:r>
+      <w:r>
+        <w:t xml:space="preserve">. Multiplying 2 and 3 first changes the problem to </w:t>
+      </w:r>
+      <w:r>
+        <w:rPr>
+          <w:i/>
+          <w:iCs/>
+        </w:rPr>
+        <w:t xml:space="preserve">6</w:t>
+      </w:r>
+      <w:r>
+        <w:rPr>
+          <w:i/>
+          <w:iCs/>
+          <w:vertAlign w:val="superscript"/>
+        </w:rPr>
+        <w:t xml:space="preserve">2</w:t>
+      </w:r>
+      <w:r>
+        <w:t xml:space="preserve">. </w:t>
+      </w:r>
+      <w:r>
+        <w:rPr>
+          <w:b/>
+          <w:bCs/>
+        </w:rPr>
+        <w:t xml:space="preserve">The correct value is </w:t>
+      </w:r>
+      <w:r>
+        <w:rPr>
+          <w:b/>
+          <w:bCs/>
+          <w:i/>
+          <w:iCs/>
+        </w:rPr>
+        <w:t xml:space="preserve">f(2)=18</w:t>
+      </w:r>
+      <w:r>
+        <w:rPr>
+          <w:b/>
+          <w:bCs/>
+        </w:rPr>
+        <w:t xml:space="preserve">.</w:t>
+      </w:r>
+    </w:p>
+    <w:p>
+      <w:pPr>
+        <w:pStyle w:val="Heading2"/>
+        <w:pageBreakBefore/>
+      </w:pPr>
+      <w:r>
+        <w:t xml:space="preserve">Example 18: Slip 4</w:t>
+      </w:r>
+    </w:p>
+    <w:p>
+      <w:pPr>
+        <w:spacing w:after="200" w:before="200"/>
+        <w:jc w:val="center"/>
+      </w:pPr>
+      <w:r>
+        <w:rPr>
+          <w:i/>
+          <w:iCs/>
+          <w:sz w:val="40"/>
+          <w:szCs w:val="40"/>
+        </w:rPr>
+        <w:t xml:space="preserve">5·(1/2)</w:t>
+      </w:r>
+      <w:r>
+        <w:rPr>
+          <w:i/>
+          <w:iCs/>
+          <w:sz w:val="40"/>
+          <w:szCs w:val="40"/>
+          <w:vertAlign w:val="superscript"/>
+        </w:rPr>
+        <w:t xml:space="preserve">−2</w:t>
+      </w:r>
+      <w:r>
+        <w:rPr>
+          <w:i/>
+          <w:iCs/>
+          <w:sz w:val="40"/>
+          <w:szCs w:val="40"/>
+        </w:rPr>
+        <w:t xml:space="preserve">=−5/4</w:t>
+      </w:r>
+    </w:p>
+    <w:p>
+      <w:pPr>
+        <w:pStyle w:val="Heading3"/>
+        <w:keepNext/>
+      </w:pPr>
+      <w:r>
+        <w:t xml:space="preserve">Question</w:t>
+      </w:r>
+    </w:p>
+    <w:p>
+      <w:pPr>
+        <w:spacing w:after="120" w:before="80" w:line="300"/>
+      </w:pPr>
+      <w:r>
+        <w:t xml:space="preserve">A student wrote this. What is the mistake, if any?</w:t>
+      </w:r>
+    </w:p>
+    <w:p>
+      <w:pPr>
+        <w:spacing w:after="40" w:before="20"/>
+        <w:ind w:left="360"/>
+      </w:pPr>
+      <w:r>
+        <w:rPr>
+          <w:b/>
+          <w:bCs/>
+        </w:rPr>
+        <w:t xml:space="preserve">A.  </w:t>
+      </w:r>
+      <w:r>
+        <w:t xml:space="preserve">The answer should be 5 times one fourth, which is positive.</w:t>
+      </w:r>
+    </w:p>
+    <w:p>
+      <w:pPr>
+        <w:spacing w:after="40" w:before="20"/>
+        <w:ind w:left="360"/>
+      </w:pPr>
+      <w:r>
+        <w:rPr>
+          <w:b/>
+          <w:bCs/>
+        </w:rPr>
+        <w:t xml:space="preserve">B.  </w:t>
+      </w:r>
+      <w:r>
+        <w:t xml:space="preserve">There is no mistake.</w:t>
+      </w:r>
+    </w:p>
+    <w:p>
+      <w:pPr>
+        <w:spacing w:after="40" w:before="20"/>
+        <w:ind w:left="360"/>
+      </w:pPr>
+      <w:r>
+        <w:rPr>
+          <w:b/>
+          <w:bCs/>
+        </w:rPr>
+        <w:t xml:space="preserve">C.  </w:t>
+      </w:r>
+      <w:r>
+        <w:t xml:space="preserve">The answer should be negative 10, from 5 times negative 2.</w:t>
+      </w:r>
+    </w:p>
+    <w:p>
+      <w:pPr>
+        <w:spacing w:after="40" w:before="20"/>
+        <w:ind w:left="360"/>
+      </w:pPr>
+      <w:r>
+        <w:rPr>
+          <w:b/>
+          <w:bCs/>
+        </w:rPr>
+        <w:t xml:space="preserve">D.  </w:t>
+      </w:r>
+      <w:r>
+        <w:t xml:space="preserve">Negative exponents flip the base, so the value is 20.</w:t>
+      </w:r>
+    </w:p>
+    <w:p>
+      <w:pPr>
+        <w:pStyle w:val="Heading3"/>
+        <w:keepNext/>
+      </w:pPr>
+      <w:r>
+        <w:t xml:space="preserve">Answer and reasoning</w:t>
+      </w:r>
+    </w:p>
+    <w:p>
+      <w:pPr>
+        <w:spacing w:after="120" w:before="80" w:line="300"/>
+      </w:pPr>
+      <w:r>
+        <w:t xml:space="preserve">A negative exponent means flip the base, not make the answer negative: </w:t>
+      </w:r>
+      <w:r>
+        <w:rPr>
+          <w:i/>
+          <w:iCs/>
+        </w:rPr>
+        <w:t xml:space="preserve">(1/2)</w:t>
+      </w:r>
+      <w:r>
+        <w:rPr>
+          <w:i/>
+          <w:iCs/>
+          <w:vertAlign w:val="superscript"/>
+        </w:rPr>
+        <w:t xml:space="preserve">−2</w:t>
+      </w:r>
+      <w:r>
+        <w:rPr>
+          <w:i/>
+          <w:iCs/>
+        </w:rPr>
+        <w:t xml:space="preserve">=2</w:t>
+      </w:r>
+      <w:r>
+        <w:rPr>
+          <w:i/>
+          <w:iCs/>
+          <w:vertAlign w:val="superscript"/>
+        </w:rPr>
+        <w:t xml:space="preserve">2</w:t>
+      </w:r>
+      <w:r>
+        <w:rPr>
+          <w:i/>
+          <w:iCs/>
+        </w:rPr>
+        <w:t xml:space="preserve">=4</w:t>
+      </w:r>
+      <w:r>
+        <w:t xml:space="preserve">. Then </w:t>
+      </w:r>
+      <w:r>
+        <w:rPr>
+          <w:i/>
+          <w:iCs/>
+        </w:rPr>
+        <w:t xml:space="preserve">5· 4=20</w:t>
+      </w:r>
+      <w:r>
+        <w:t xml:space="preserve">. An exponential function with a positive </w:t>
+      </w:r>
+      <w:r>
+        <w:rPr>
+          <w:i/>
+          <w:iCs/>
+        </w:rPr>
+        <w:t xml:space="preserve">a</w:t>
+      </w:r>
+      <w:r>
+        <w:t xml:space="preserve"> never gives a negative value. </w:t>
+      </w:r>
+      <w:r>
+        <w:rPr>
+          <w:b/>
+          <w:bCs/>
+        </w:rPr>
+        <w:t xml:space="preserve">The correct value is 20.</w:t>
+      </w:r>
+    </w:p>
+    <w:p>
+      <w:pPr>
+        <w:pStyle w:val="Heading2"/>
+        <w:pageBreakBefore/>
+      </w:pPr>
+      <w:r>
+        <w:t xml:space="preserve">Example 19: Slip 5</w:t>
+      </w:r>
+    </w:p>
+    <w:p>
+      <w:pPr>
+        <w:spacing w:after="40" w:before="200"/>
+        <w:jc w:val="center"/>
+      </w:pPr>
+      <w:r>
+        <w:rPr>
+          <w:i/>
+          <w:iCs/>
+          <w:sz w:val="40"/>
+          <w:szCs w:val="40"/>
+        </w:rPr>
+        <w:t xml:space="preserve">f(x)=3e</w:t>
+      </w:r>
+      <w:r>
+        <w:rPr>
+          <w:i/>
+          <w:iCs/>
+          <w:sz w:val="40"/>
+          <w:szCs w:val="40"/>
+          <w:vertAlign w:val="superscript"/>
+        </w:rPr>
+        <w:t xml:space="preserve">x</w:t>
+      </w:r>
+    </w:p>
+    <w:p>
+      <w:pPr>
+        <w:spacing w:after="200" w:before="40"/>
+        <w:jc w:val="center"/>
+      </w:pPr>
+      <w:r>
+        <w:rPr>
+          <w:i/>
+          <w:iCs/>
+          <w:sz w:val="40"/>
+          <w:szCs w:val="40"/>
+        </w:rPr>
+        <w:t xml:space="preserve">f(0)=3e</w:t>
+      </w:r>
+      <w:r>
+        <w:rPr>
+          <w:i/>
+          <w:iCs/>
+          <w:sz w:val="40"/>
+          <w:szCs w:val="40"/>
+          <w:vertAlign w:val="superscript"/>
+        </w:rPr>
+        <w:t xml:space="preserve">0</w:t>
+      </w:r>
+      <w:r>
+        <w:rPr>
+          <w:i/>
+          <w:iCs/>
+          <w:sz w:val="40"/>
+          <w:szCs w:val="40"/>
+        </w:rPr>
+        <w:t xml:space="preserve">=3</w:t>
+      </w:r>
+    </w:p>
+    <w:p>
+      <w:pPr>
+        <w:pStyle w:val="Heading3"/>
+        <w:keepNext/>
+      </w:pPr>
+      <w:r>
+        <w:t xml:space="preserve">Question</w:t>
+      </w:r>
+    </w:p>
+    <w:p>
+      <w:pPr>
+        <w:spacing w:after="120" w:before="80" w:line="300"/>
+      </w:pPr>
+      <w:r>
+        <w:t xml:space="preserve">A student wrote this. What is the mistake, if any?</w:t>
+      </w:r>
+    </w:p>
+    <w:p>
+      <w:pPr>
+        <w:spacing w:after="40" w:before="20"/>
+        <w:ind w:left="360"/>
+      </w:pPr>
+      <w:r>
+        <w:rPr>
+          <w:b/>
+          <w:bCs/>
+        </w:rPr>
+        <w:t xml:space="preserve">A.  </w:t>
+      </w:r>
+      <w:r>
+        <w:t xml:space="preserve">The answer should be 3 times e, about 8.15.</w:t>
+      </w:r>
+    </w:p>
+    <w:p>
+      <w:pPr>
+        <w:spacing w:after="40" w:before="20"/>
+        <w:ind w:left="360"/>
+      </w:pPr>
+      <w:r>
+        <w:rPr>
+          <w:b/>
+          <w:bCs/>
+        </w:rPr>
+        <w:t xml:space="preserve">B.  </w:t>
+      </w:r>
+      <w:r>
+        <w:t xml:space="preserve">The answer should be 0, since anything times 0 is 0.</w:t>
+      </w:r>
+    </w:p>
+    <w:p>
+      <w:pPr>
+        <w:spacing w:after="40" w:before="20"/>
+        <w:ind w:left="360"/>
+      </w:pPr>
+      <w:r>
+        <w:rPr>
+          <w:b/>
+          <w:bCs/>
+        </w:rPr>
+        <w:t xml:space="preserve">C.  </w:t>
+      </w:r>
+      <w:r>
+        <w:t xml:space="preserve">There is no mistake.</w:t>
+      </w:r>
+    </w:p>
+    <w:p>
+      <w:pPr>
+        <w:spacing w:after="40" w:before="20"/>
+        <w:ind w:left="360"/>
+      </w:pPr>
+      <w:r>
+        <w:rPr>
+          <w:b/>
+          <w:bCs/>
+        </w:rPr>
+        <w:t xml:space="preserve">D.  </w:t>
+      </w:r>
+      <w:r>
+        <w:t xml:space="preserve">The answer should be 1, since e to the 0 is 1.</w:t>
+      </w:r>
+    </w:p>
+    <w:p>
+      <w:pPr>
+        <w:pStyle w:val="Heading3"/>
+        <w:keepNext/>
+      </w:pPr>
+      <w:r>
+        <w:t xml:space="preserve">Answer and reasoning</w:t>
+      </w:r>
+    </w:p>
+    <w:p>
+      <w:pPr>
+        <w:spacing w:after="120" w:before="80" w:line="300"/>
+      </w:pPr>
+      <w:r>
+        <w:t xml:space="preserve">Any nonzero number to the 0 power is 1, and </w:t>
+      </w:r>
+      <w:r>
+        <w:rPr>
+          <w:i/>
+          <w:iCs/>
+        </w:rPr>
+        <w:t xml:space="preserve">e</w:t>
+      </w:r>
+      <w:r>
+        <w:t xml:space="preserve"> is a number, so </w:t>
+      </w:r>
+      <w:r>
+        <w:rPr>
+          <w:i/>
+          <w:iCs/>
+        </w:rPr>
+        <w:t xml:space="preserve">e</w:t>
+      </w:r>
+      <w:r>
+        <w:rPr>
+          <w:i/>
+          <w:iCs/>
+          <w:vertAlign w:val="superscript"/>
+        </w:rPr>
+        <w:t xml:space="preserve">0</w:t>
+      </w:r>
+      <w:r>
+        <w:rPr>
+          <w:i/>
+          <w:iCs/>
+        </w:rPr>
+        <w:t xml:space="preserve">=1</w:t>
+      </w:r>
+      <w:r>
+        <w:t xml:space="preserve">. Then </w:t>
+      </w:r>
+      <w:r>
+        <w:rPr>
+          <w:i/>
+          <w:iCs/>
+        </w:rPr>
+        <w:t xml:space="preserve">3· 1=3</w:t>
+      </w:r>
+      <w:r>
+        <w:t xml:space="preserve">. The value at </w:t>
+      </w:r>
+      <w:r>
+        <w:rPr>
+          <w:i/>
+          <w:iCs/>
+        </w:rPr>
+        <w:t xml:space="preserve">x=0</w:t>
+      </w:r>
+      <w:r>
+        <w:t xml:space="preserve"> is always the starting value </w:t>
+      </w:r>
+      <w:r>
+        <w:rPr>
+          <w:i/>
+          <w:iCs/>
+        </w:rPr>
+        <w:t xml:space="preserve">a</w:t>
+      </w:r>
+      <w:r>
+        <w:t xml:space="preserve">. </w:t>
+      </w:r>
+      <w:r>
+        <w:rPr>
+          <w:b/>
+          <w:bCs/>
+        </w:rPr>
+        <w:t xml:space="preserve">There is no mistake: </w:t>
+      </w:r>
+      <w:r>
+        <w:rPr>
+          <w:b/>
+          <w:bCs/>
+          <w:i/>
+          <w:iCs/>
+        </w:rPr>
+        <w:t xml:space="preserve">f(0)=3</w:t>
+      </w:r>
+      <w:r>
+        <w:rPr>
+          <w:b/>
+          <w:bCs/>
+        </w:rPr>
+        <w:t xml:space="preserve">.</w:t>
+      </w:r>
+    </w:p>
     <w:sectPr>
       <w:headerReference w:type="default" r:id="rId7"/>
       <w:footerReference w:type="default" r:id="rId8"/>

</xml_diff>

<commit_message>
Slip tabs: audit fixes (EL5 'if any' prompts and two-line equation, varied position of the correct-work item, clearer speech for -2^x), audit notes for FN1-EL5
Co-Authored-By: Claude Opus 5.5 <noreply@anthropic.com>
Claude-Session: https://claude.ai/code/session_013Y8PfETWcMLvmUEpCdE8Wq
</commit_message>
<xml_diff>
--- a/support-materials/EL1/EL1_worked_examples.docx
+++ b/support-materials/EL1/EL1_worked_examples.docx
@@ -6007,7 +6007,7 @@
     </w:p>
     <w:p>
       <w:pPr>
-        <w:spacing w:after="200" w:before="200"/>
+        <w:spacing w:after="40" w:before="200"/>
         <w:jc w:val="center"/>
       </w:pPr>
       <w:r>
@@ -6017,7 +6017,7 @@
           <w:sz w:val="40"/>
           <w:szCs w:val="40"/>
         </w:rPr>
-        <w:t xml:space="preserve">5·(1/2)</w:t>
+        <w:t xml:space="preserve">f(x)=3e</w:t>
       </w:r>
       <w:r>
         <w:rPr>
@@ -6027,8 +6027,14 @@
           <w:szCs w:val="40"/>
           <w:vertAlign w:val="superscript"/>
         </w:rPr>
-        <w:t xml:space="preserve">−2</w:t>
-      </w:r>
+        <w:t xml:space="preserve">x</w:t>
+      </w:r>
+    </w:p>
+    <w:p>
+      <w:pPr>
+        <w:spacing w:after="200" w:before="40"/>
+        <w:jc w:val="center"/>
+      </w:pPr>
       <w:r>
         <w:rPr>
           <w:i/>
@@ -6036,196 +6042,7 @@
           <w:sz w:val="40"/>
           <w:szCs w:val="40"/>
         </w:rPr>
-        <w:t xml:space="preserve">=−5/4</w:t>
-      </w:r>
-    </w:p>
-    <w:p>
-      <w:pPr>
-        <w:pStyle w:val="Heading3"/>
-        <w:keepNext/>
-      </w:pPr>
-      <w:r>
-        <w:t xml:space="preserve">Question</w:t>
-      </w:r>
-    </w:p>
-    <w:p>
-      <w:pPr>
-        <w:spacing w:after="120" w:before="80" w:line="300"/>
-      </w:pPr>
-      <w:r>
-        <w:t xml:space="preserve">A student wrote this. What is the mistake, if any?</w:t>
-      </w:r>
-    </w:p>
-    <w:p>
-      <w:pPr>
-        <w:spacing w:after="40" w:before="20"/>
-        <w:ind w:left="360"/>
-      </w:pPr>
-      <w:r>
-        <w:rPr>
-          <w:b/>
-          <w:bCs/>
-        </w:rPr>
-        <w:t xml:space="preserve">A.  </w:t>
-      </w:r>
-      <w:r>
-        <w:t xml:space="preserve">The answer should be 5 times one fourth, which is positive.</w:t>
-      </w:r>
-    </w:p>
-    <w:p>
-      <w:pPr>
-        <w:spacing w:after="40" w:before="20"/>
-        <w:ind w:left="360"/>
-      </w:pPr>
-      <w:r>
-        <w:rPr>
-          <w:b/>
-          <w:bCs/>
-        </w:rPr>
-        <w:t xml:space="preserve">B.  </w:t>
-      </w:r>
-      <w:r>
-        <w:t xml:space="preserve">There is no mistake.</w:t>
-      </w:r>
-    </w:p>
-    <w:p>
-      <w:pPr>
-        <w:spacing w:after="40" w:before="20"/>
-        <w:ind w:left="360"/>
-      </w:pPr>
-      <w:r>
-        <w:rPr>
-          <w:b/>
-          <w:bCs/>
-        </w:rPr>
-        <w:t xml:space="preserve">C.  </w:t>
-      </w:r>
-      <w:r>
-        <w:t xml:space="preserve">The answer should be negative 10, from 5 times negative 2.</w:t>
-      </w:r>
-    </w:p>
-    <w:p>
-      <w:pPr>
-        <w:spacing w:after="40" w:before="20"/>
-        <w:ind w:left="360"/>
-      </w:pPr>
-      <w:r>
-        <w:rPr>
-          <w:b/>
-          <w:bCs/>
-        </w:rPr>
-        <w:t xml:space="preserve">D.  </w:t>
-      </w:r>
-      <w:r>
-        <w:t xml:space="preserve">Negative exponents flip the base, so the value is 20.</w:t>
-      </w:r>
-    </w:p>
-    <w:p>
-      <w:pPr>
-        <w:pStyle w:val="Heading3"/>
-        <w:keepNext/>
-      </w:pPr>
-      <w:r>
-        <w:t xml:space="preserve">Answer and reasoning</w:t>
-      </w:r>
-    </w:p>
-    <w:p>
-      <w:pPr>
-        <w:spacing w:after="120" w:before="80" w:line="300"/>
-      </w:pPr>
-      <w:r>
-        <w:t xml:space="preserve">A negative exponent means flip the base, not make the answer negative: </w:t>
-      </w:r>
-      <w:r>
-        <w:rPr>
-          <w:i/>
-          <w:iCs/>
-        </w:rPr>
-        <w:t xml:space="preserve">(1/2)</w:t>
-      </w:r>
-      <w:r>
-        <w:rPr>
-          <w:i/>
-          <w:iCs/>
-          <w:vertAlign w:val="superscript"/>
-        </w:rPr>
-        <w:t xml:space="preserve">−2</w:t>
-      </w:r>
-      <w:r>
-        <w:rPr>
-          <w:i/>
-          <w:iCs/>
-        </w:rPr>
-        <w:t xml:space="preserve">=2</w:t>
-      </w:r>
-      <w:r>
-        <w:rPr>
-          <w:i/>
-          <w:iCs/>
-          <w:vertAlign w:val="superscript"/>
-        </w:rPr>
-        <w:t xml:space="preserve">2</w:t>
-      </w:r>
-      <w:r>
-        <w:rPr>
-          <w:i/>
-          <w:iCs/>
-        </w:rPr>
-        <w:t xml:space="preserve">=4</w:t>
-      </w:r>
-      <w:r>
-        <w:t xml:space="preserve">. Then </w:t>
-      </w:r>
-      <w:r>
-        <w:rPr>
-          <w:i/>
-          <w:iCs/>
-        </w:rPr>
-        <w:t xml:space="preserve">5· 4=20</w:t>
-      </w:r>
-      <w:r>
-        <w:t xml:space="preserve">. An exponential function with a positive </w:t>
-      </w:r>
-      <w:r>
-        <w:rPr>
-          <w:i/>
-          <w:iCs/>
-        </w:rPr>
-        <w:t xml:space="preserve">a</w:t>
-      </w:r>
-      <w:r>
-        <w:t xml:space="preserve"> never gives a negative value. </w:t>
-      </w:r>
-      <w:r>
-        <w:rPr>
-          <w:b/>
-          <w:bCs/>
-        </w:rPr>
-        <w:t xml:space="preserve">The correct value is 20.</w:t>
-      </w:r>
-    </w:p>
-    <w:p>
-      <w:pPr>
-        <w:pStyle w:val="Heading2"/>
-        <w:pageBreakBefore/>
-      </w:pPr>
-      <w:r>
-        <w:t xml:space="preserve">Example 19: Slip 5</w:t>
-      </w:r>
-    </w:p>
-    <w:p>
-      <w:pPr>
-        <w:spacing w:after="40" w:before="200"/>
-        <w:jc w:val="center"/>
-      </w:pPr>
-      <w:r>
-        <w:rPr>
-          <w:i/>
-          <w:iCs/>
-          <w:sz w:val="40"/>
-          <w:szCs w:val="40"/>
-        </w:rPr>
-        <w:t xml:space="preserve">f(x)=3e</w:t>
+        <w:t xml:space="preserve">f(0)=3e</w:t>
       </w:r>
       <w:r>
         <w:rPr>
@@ -6235,14 +6052,8 @@
           <w:szCs w:val="40"/>
           <w:vertAlign w:val="superscript"/>
         </w:rPr>
-        <w:t xml:space="preserve">x</w:t>
-      </w:r>
-    </w:p>
-    <w:p>
-      <w:pPr>
-        <w:spacing w:after="200" w:before="40"/>
-        <w:jc w:val="center"/>
-      </w:pPr>
+        <w:t xml:space="preserve">0</w:t>
+      </w:r>
       <w:r>
         <w:rPr>
           <w:i/>
@@ -6250,7 +6061,217 @@
           <w:sz w:val="40"/>
           <w:szCs w:val="40"/>
         </w:rPr>
-        <w:t xml:space="preserve">f(0)=3e</w:t>
+        <w:t xml:space="preserve">=3</w:t>
+      </w:r>
+    </w:p>
+    <w:p>
+      <w:pPr>
+        <w:pStyle w:val="Heading3"/>
+        <w:keepNext/>
+      </w:pPr>
+      <w:r>
+        <w:t xml:space="preserve">Question</w:t>
+      </w:r>
+    </w:p>
+    <w:p>
+      <w:pPr>
+        <w:spacing w:after="120" w:before="80" w:line="300"/>
+      </w:pPr>
+      <w:r>
+        <w:t xml:space="preserve">A student wrote this. What is the mistake, if any?</w:t>
+      </w:r>
+    </w:p>
+    <w:p>
+      <w:pPr>
+        <w:spacing w:after="40" w:before="20"/>
+        <w:ind w:left="360"/>
+      </w:pPr>
+      <w:r>
+        <w:rPr>
+          <w:b/>
+          <w:bCs/>
+        </w:rPr>
+        <w:t xml:space="preserve">A.  </w:t>
+      </w:r>
+      <w:r>
+        <w:t xml:space="preserve">The answer should be 3 times e, about 8.15.</w:t>
+      </w:r>
+    </w:p>
+    <w:p>
+      <w:pPr>
+        <w:spacing w:after="40" w:before="20"/>
+        <w:ind w:left="360"/>
+      </w:pPr>
+      <w:r>
+        <w:rPr>
+          <w:b/>
+          <w:bCs/>
+        </w:rPr>
+        <w:t xml:space="preserve">B.  </w:t>
+      </w:r>
+      <w:r>
+        <w:t xml:space="preserve">The answer should be 0, since anything times 0 is 0.</w:t>
+      </w:r>
+    </w:p>
+    <w:p>
+      <w:pPr>
+        <w:spacing w:after="40" w:before="20"/>
+        <w:ind w:left="360"/>
+      </w:pPr>
+      <w:r>
+        <w:rPr>
+          <w:b/>
+          <w:bCs/>
+        </w:rPr>
+        <w:t xml:space="preserve">C.  </w:t>
+      </w:r>
+      <w:r>
+        <w:t xml:space="preserve">There is no mistake.</w:t>
+      </w:r>
+    </w:p>
+    <w:p>
+      <w:pPr>
+        <w:spacing w:after="40" w:before="20"/>
+        <w:ind w:left="360"/>
+      </w:pPr>
+      <w:r>
+        <w:rPr>
+          <w:b/>
+          <w:bCs/>
+        </w:rPr>
+        <w:t xml:space="preserve">D.  </w:t>
+      </w:r>
+      <w:r>
+        <w:t xml:space="preserve">The answer should be 1, since e to the 0 is 1.</w:t>
+      </w:r>
+    </w:p>
+    <w:p>
+      <w:pPr>
+        <w:pStyle w:val="Heading3"/>
+        <w:keepNext/>
+      </w:pPr>
+      <w:r>
+        <w:t xml:space="preserve">Answer and reasoning</w:t>
+      </w:r>
+    </w:p>
+    <w:p>
+      <w:pPr>
+        <w:spacing w:after="120" w:before="80" w:line="300"/>
+      </w:pPr>
+      <w:r>
+        <w:t xml:space="preserve">Any nonzero number to the 0 power is 1, and </w:t>
+      </w:r>
+      <w:r>
+        <w:rPr>
+          <w:i/>
+          <w:iCs/>
+        </w:rPr>
+        <w:t xml:space="preserve">e</w:t>
+      </w:r>
+      <w:r>
+        <w:t xml:space="preserve"> is a number, so </w:t>
+      </w:r>
+      <w:r>
+        <w:rPr>
+          <w:i/>
+          <w:iCs/>
+        </w:rPr>
+        <w:t xml:space="preserve">e</w:t>
+      </w:r>
+      <w:r>
+        <w:rPr>
+          <w:i/>
+          <w:iCs/>
+          <w:vertAlign w:val="superscript"/>
+        </w:rPr>
+        <w:t xml:space="preserve">0</w:t>
+      </w:r>
+      <w:r>
+        <w:rPr>
+          <w:i/>
+          <w:iCs/>
+        </w:rPr>
+        <w:t xml:space="preserve">=1</w:t>
+      </w:r>
+      <w:r>
+        <w:t xml:space="preserve">. Then </w:t>
+      </w:r>
+      <w:r>
+        <w:rPr>
+          <w:i/>
+          <w:iCs/>
+        </w:rPr>
+        <w:t xml:space="preserve">3· 1=3</w:t>
+      </w:r>
+      <w:r>
+        <w:t xml:space="preserve">. The value at </w:t>
+      </w:r>
+      <w:r>
+        <w:rPr>
+          <w:i/>
+          <w:iCs/>
+        </w:rPr>
+        <w:t xml:space="preserve">x=0</w:t>
+      </w:r>
+      <w:r>
+        <w:t xml:space="preserve"> is always the starting value </w:t>
+      </w:r>
+      <w:r>
+        <w:rPr>
+          <w:i/>
+          <w:iCs/>
+        </w:rPr>
+        <w:t xml:space="preserve">a</w:t>
+      </w:r>
+      <w:r>
+        <w:t xml:space="preserve">. </w:t>
+      </w:r>
+      <w:r>
+        <w:rPr>
+          <w:b/>
+          <w:bCs/>
+        </w:rPr>
+        <w:t xml:space="preserve">There is no mistake: </w:t>
+      </w:r>
+      <w:r>
+        <w:rPr>
+          <w:b/>
+          <w:bCs/>
+          <w:i/>
+          <w:iCs/>
+        </w:rPr>
+        <w:t xml:space="preserve">f(0)=3</w:t>
+      </w:r>
+      <w:r>
+        <w:rPr>
+          <w:b/>
+          <w:bCs/>
+        </w:rPr>
+        <w:t xml:space="preserve">.</w:t>
+      </w:r>
+    </w:p>
+    <w:p>
+      <w:pPr>
+        <w:pStyle w:val="Heading2"/>
+        <w:pageBreakBefore/>
+      </w:pPr>
+      <w:r>
+        <w:t xml:space="preserve">Example 19: Slip 5</w:t>
+      </w:r>
+    </w:p>
+    <w:p>
+      <w:pPr>
+        <w:spacing w:after="200" w:before="200"/>
+        <w:jc w:val="center"/>
+      </w:pPr>
+      <w:r>
+        <w:rPr>
+          <w:i/>
+          <w:iCs/>
+          <w:sz w:val="40"/>
+          <w:szCs w:val="40"/>
+        </w:rPr>
+        <w:t xml:space="preserve">5·(1/2)</w:t>
       </w:r>
       <w:r>
         <w:rPr>
@@ -6260,7 +6281,7 @@
           <w:szCs w:val="40"/>
           <w:vertAlign w:val="superscript"/>
         </w:rPr>
-        <w:t xml:space="preserve">0</w:t>
+        <w:t xml:space="preserve">−2</w:t>
       </w:r>
       <w:r>
         <w:rPr>
@@ -6269,7 +6290,7 @@
           <w:sz w:val="40"/>
           <w:szCs w:val="40"/>
         </w:rPr>
-        <w:t xml:space="preserve">=3</w:t>
+        <w:t xml:space="preserve">=−5/4</w:t>
       </w:r>
     </w:p>
     <w:p>
@@ -6302,7 +6323,7 @@
         <w:t xml:space="preserve">A.  </w:t>
       </w:r>
       <w:r>
-        <w:t xml:space="preserve">The answer should be 3 times e, about 8.15.</w:t>
+        <w:t xml:space="preserve">The answer should be 5 times one fourth, which is positive.</w:t>
       </w:r>
     </w:p>
     <w:p>
@@ -6318,7 +6339,7 @@
         <w:t xml:space="preserve">B.  </w:t>
       </w:r>
       <w:r>
-        <w:t xml:space="preserve">The answer should be 0, since anything times 0 is 0.</w:t>
+        <w:t xml:space="preserve">There is no mistake.</w:t>
       </w:r>
     </w:p>
     <w:p>
@@ -6334,7 +6355,7 @@
         <w:t xml:space="preserve">C.  </w:t>
       </w:r>
       <w:r>
-        <w:t xml:space="preserve">There is no mistake.</w:t>
+        <w:t xml:space="preserve">The answer should be negative 10, from 5 times negative 2.</w:t>
       </w:r>
     </w:p>
     <w:p>
@@ -6350,7 +6371,7 @@
         <w:t xml:space="preserve">D.  </w:t>
       </w:r>
       <w:r>
-        <w:t xml:space="preserve">The answer should be 1, since e to the 0 is 1.</w:t>
+        <w:t xml:space="preserve">Negative exponents flip the base, so the value is 20.</w:t>
       </w:r>
     </w:p>
     <w:p>
@@ -6367,24 +6388,14 @@
         <w:spacing w:after="120" w:before="80" w:line="300"/>
       </w:pPr>
       <w:r>
-        <w:t xml:space="preserve">Any nonzero number to the 0 power is 1, and </w:t>
-      </w:r>
-      <w:r>
-        <w:rPr>
-          <w:i/>
-          <w:iCs/>
-        </w:rPr>
-        <w:t xml:space="preserve">e</w:t>
-      </w:r>
-      <w:r>
-        <w:t xml:space="preserve"> is a number, so </w:t>
-      </w:r>
-      <w:r>
-        <w:rPr>
-          <w:i/>
-          <w:iCs/>
-        </w:rPr>
-        <w:t xml:space="preserve">e</w:t>
+        <w:t xml:space="preserve">A negative exponent means flip the base, not make the answer negative: </w:t>
+      </w:r>
+      <w:r>
+        <w:rPr>
+          <w:i/>
+          <w:iCs/>
+        </w:rPr>
+        <w:t xml:space="preserve">(1/2)</w:t>
       </w:r>
       <w:r>
         <w:rPr>
@@ -6392,14 +6403,29 @@
           <w:iCs/>
           <w:vertAlign w:val="superscript"/>
         </w:rPr>
-        <w:t xml:space="preserve">0</w:t>
-      </w:r>
-      <w:r>
-        <w:rPr>
-          <w:i/>
-          <w:iCs/>
-        </w:rPr>
-        <w:t xml:space="preserve">=1</w:t>
+        <w:t xml:space="preserve">−2</w:t>
+      </w:r>
+      <w:r>
+        <w:rPr>
+          <w:i/>
+          <w:iCs/>
+        </w:rPr>
+        <w:t xml:space="preserve">=2</w:t>
+      </w:r>
+      <w:r>
+        <w:rPr>
+          <w:i/>
+          <w:iCs/>
+          <w:vertAlign w:val="superscript"/>
+        </w:rPr>
+        <w:t xml:space="preserve">2</w:t>
+      </w:r>
+      <w:r>
+        <w:rPr>
+          <w:i/>
+          <w:iCs/>
+        </w:rPr>
+        <w:t xml:space="preserve">=4</w:t>
       </w:r>
       <w:r>
         <w:t xml:space="preserve">. Then </w:t>
@@ -6409,20 +6435,10 @@
           <w:i/>
           <w:iCs/>
         </w:rPr>
-        <w:t xml:space="preserve">3· 1=3</w:t>
-      </w:r>
-      <w:r>
-        <w:t xml:space="preserve">. The value at </w:t>
-      </w:r>
-      <w:r>
-        <w:rPr>
-          <w:i/>
-          <w:iCs/>
-        </w:rPr>
-        <w:t xml:space="preserve">x=0</w:t>
-      </w:r>
-      <w:r>
-        <w:t xml:space="preserve"> is always the starting value </w:t>
+        <w:t xml:space="preserve">5· 4=20</w:t>
+      </w:r>
+      <w:r>
+        <w:t xml:space="preserve">. An exponential function with a positive </w:t>
       </w:r>
       <w:r>
         <w:rPr>
@@ -6432,30 +6448,14 @@
         <w:t xml:space="preserve">a</w:t>
       </w:r>
       <w:r>
-        <w:t xml:space="preserve">. </w:t>
-      </w:r>
-      <w:r>
-        <w:rPr>
-          <w:b/>
-          <w:bCs/>
-        </w:rPr>
-        <w:t xml:space="preserve">There is no mistake: </w:t>
-      </w:r>
-      <w:r>
-        <w:rPr>
-          <w:b/>
-          <w:bCs/>
-          <w:i/>
-          <w:iCs/>
-        </w:rPr>
-        <w:t xml:space="preserve">f(0)=3</w:t>
-      </w:r>
-      <w:r>
-        <w:rPr>
-          <w:b/>
-          <w:bCs/>
-        </w:rPr>
-        <w:t xml:space="preserve">.</w:t>
+        <w:t xml:space="preserve"> never gives a negative value. </w:t>
+      </w:r>
+      <w:r>
+        <w:rPr>
+          <w:b/>
+          <w:bCs/>
+        </w:rPr>
+        <w:t xml:space="preserve">The correct value is 20.</w:t>
       </w:r>
     </w:p>
     <w:sectPr>

</xml_diff>

<commit_message>
PR4: content, figures, worked examples, Canvas quiz, LibreTexts code (audit pending); doc tool prints \div as ÷ (EL1 doc regenerated)
Co-Authored-By: Claude Opus 5.5 <noreply@anthropic.com>
Claude-Session: https://claude.ai/code/session_013Y8PfETWcMLvmUEpCdE8Wq
</commit_message>
<xml_diff>
--- a/support-materials/EL1/EL1_worked_examples.docx
+++ b/support-materials/EL1/EL1_worked_examples.docx
@@ -5355,7 +5355,7 @@
           <w:i/>
           <w:iCs/>
         </w:rPr>
-        <w:t xml:space="preserve">6div 2=3</w:t>
+        <w:t xml:space="preserve">6÷ 2=3</w:t>
       </w:r>
       <w:r>
         <w:t xml:space="preserve">, </w:t>
@@ -5365,7 +5365,7 @@
           <w:i/>
           <w:iCs/>
         </w:rPr>
-        <w:t xml:space="preserve">18div 6=3</w:t>
+        <w:t xml:space="preserve">18÷ 6=3</w:t>
       </w:r>
       <w:r>
         <w:t xml:space="preserve">, </w:t>
@@ -5375,7 +5375,7 @@
           <w:i/>
           <w:iCs/>
         </w:rPr>
-        <w:t xml:space="preserve">54div 18=3</w:t>
+        <w:t xml:space="preserve">54÷ 18=3</w:t>
       </w:r>
       <w:r>
         <w:t xml:space="preserve">. The ratios are all 3. Unequal differences only rule out linear. </w:t>

</xml_diff>